<commit_message>
BRD-13 Data Migration document set v1.0: sign-off form layout, short sheet names
Co-Authored-By: Claude Opus 5.5 <noreply@anthropic.com>
Claude-Session: https://claude.ai/code/session_01W3DAuLtsQmip7EuxjJCCtN
</commit_message>
<xml_diff>
--- a/docs/deliverables/out/Migration/BIBS_Migration_BRD-13_Reconciliation_Approach_and_Signoff_v1.0.docx
+++ b/docs/deliverables/out/Migration/BIBS_Migration_BRD-13_Reconciliation_Approach_and_Signoff_v1.0.docx
@@ -1678,7 +1678,7 @@
           <w:t xml:space="preserve">	</w:t>
         </w:r>
         <w:r>
-          <w:t xml:space="preserve">10</w:t>
+          <w:t xml:space="preserve">9</w:t>
         </w:r>
       </w:hyperlink>
     </w:p>
@@ -1710,7 +1710,7 @@
           <w:t xml:space="preserve">	</w:t>
         </w:r>
         <w:r>
-          <w:t xml:space="preserve">12</w:t>
+          <w:t xml:space="preserve">11</w:t>
         </w:r>
       </w:hyperlink>
     </w:p>
@@ -1726,7 +1726,7 @@
           <w:t xml:space="preserve">	</w:t>
         </w:r>
         <w:r>
-          <w:t xml:space="preserve">13</w:t>
+          <w:t xml:space="preserve">12</w:t>
         </w:r>
       </w:hyperlink>
       <w:r>
@@ -9795,14 +9795,6 @@
     </w:p>
     <w:p>
       <w:pPr>
-        <w:spacing w:after="0"/>
-      </w:pPr>
-      <w:r>
-        <w:br w:type="page"/>
-      </w:r>
-    </w:p>
-    <w:p>
-      <w:pPr>
         <w:pStyle w:val="Heading1"/>
         <w:pBdr>
           <w:bottom w:val="single" w:sz="4" w:space="4" w:color="99C1E7"/>
@@ -9819,6 +9811,14 @@
       <w:r>
         <w:rPr/>
         <w:t>The forms below are signed in the Migration Console (gates G5 and G6) and printed for the project file. One form per object and cycle.</w:t>
+      </w:r>
+    </w:p>
+    <w:p>
+      <w:pPr>
+        <w:spacing w:after="0"/>
+      </w:pPr>
+      <w:r>
+        <w:br w:type="page"/>
       </w:r>
     </w:p>
     <w:p>
@@ -11413,81 +11413,6 @@
           </w:p>
         </w:tc>
       </w:tr>
-      <w:tr>
-        <w:trPr>
-          <w:cantSplit w:val="true"/>
-        </w:trPr>
-        <w:tc>
-          <w:tcPr>
-            <w:tcW w:type="dxa" w:w="721"/>
-            <w:tcMar>
-              <w:top w:w="50" w:type="dxa"/>
-              <w:bottom w:w="50" w:type="dxa"/>
-              <w:left w:w="90" w:type="dxa"/>
-              <w:right w:w="90" w:type="dxa"/>
-            </w:tcMar>
-          </w:tcPr>
-          <w:p>
-            <w:pPr>
-              <w:pStyle w:val="BDOITable"/>
-            </w:pPr>
-            <w:r>
-              <w:rPr>
-                <w:sz w:val="17"/>
-              </w:rPr>
-              <w:t>3</w:t>
-            </w:r>
-          </w:p>
-        </w:tc>
-        <w:tc>
-          <w:tcPr>
-            <w:tcW w:type="dxa" w:w="3845"/>
-            <w:tcMar>
-              <w:top w:w="50" w:type="dxa"/>
-              <w:bottom w:w="50" w:type="dxa"/>
-              <w:left w:w="90" w:type="dxa"/>
-              <w:right w:w="90" w:type="dxa"/>
-            </w:tcMar>
-          </w:tcPr>
-          <w:p>
-            <w:pPr>
-              <w:pStyle w:val="BDOITable"/>
-            </w:pPr>
-          </w:p>
-        </w:tc>
-        <w:tc>
-          <w:tcPr>
-            <w:tcW w:type="dxa" w:w="3004"/>
-            <w:tcMar>
-              <w:top w:w="50" w:type="dxa"/>
-              <w:bottom w:w="50" w:type="dxa"/>
-              <w:left w:w="90" w:type="dxa"/>
-              <w:right w:w="90" w:type="dxa"/>
-            </w:tcMar>
-          </w:tcPr>
-          <w:p>
-            <w:pPr>
-              <w:pStyle w:val="BDOITable"/>
-            </w:pPr>
-          </w:p>
-        </w:tc>
-        <w:tc>
-          <w:tcPr>
-            <w:tcW w:type="dxa" w:w="2403"/>
-            <w:tcMar>
-              <w:top w:w="50" w:type="dxa"/>
-              <w:bottom w:w="50" w:type="dxa"/>
-              <w:left w:w="90" w:type="dxa"/>
-              <w:right w:w="90" w:type="dxa"/>
-            </w:tcMar>
-          </w:tcPr>
-          <w:p>
-            <w:pPr>
-              <w:pStyle w:val="BDOITable"/>
-            </w:pPr>
-          </w:p>
-        </w:tc>
-      </w:tr>
     </w:tbl>
     <w:p>
       <w:pPr>
@@ -11649,109 +11574,6 @@
               </w:rPr>
               <w:t>Date</w:t>
             </w:r>
-          </w:p>
-        </w:tc>
-      </w:tr>
-      <w:tr>
-        <w:trPr>
-          <w:cantSplit w:val="true"/>
-          <w:trHeight w:val="737" w:hRule="atLeast"/>
-        </w:trPr>
-        <w:tc>
-          <w:tcPr>
-            <w:tcW w:type="dxa" w:w="2266"/>
-            <w:tcMar>
-              <w:top w:w="50" w:type="dxa"/>
-              <w:bottom w:w="50" w:type="dxa"/>
-              <w:left w:w="90" w:type="dxa"/>
-              <w:right w:w="90" w:type="dxa"/>
-            </w:tcMar>
-            <w:vAlign w:val="center"/>
-          </w:tcPr>
-          <w:p>
-            <w:pPr>
-              <w:pStyle w:val="BDOITable"/>
-            </w:pPr>
-          </w:p>
-        </w:tc>
-        <w:tc>
-          <w:tcPr>
-            <w:tcW w:type="dxa" w:w="2380"/>
-            <w:tcMar>
-              <w:top w:w="50" w:type="dxa"/>
-              <w:bottom w:w="50" w:type="dxa"/>
-              <w:left w:w="90" w:type="dxa"/>
-              <w:right w:w="90" w:type="dxa"/>
-            </w:tcMar>
-            <w:vAlign w:val="center"/>
-          </w:tcPr>
-          <w:p>
-            <w:pPr>
-              <w:pStyle w:val="BDOITable"/>
-            </w:pPr>
-            <w:r>
-              <w:rPr>
-                <w:sz w:val="18"/>
-              </w:rPr>
-              <w:t>Data steward (prepared)</w:t>
-            </w:r>
-          </w:p>
-        </w:tc>
-        <w:tc>
-          <w:tcPr>
-            <w:tcW w:type="dxa" w:w="2380"/>
-            <w:tcMar>
-              <w:top w:w="50" w:type="dxa"/>
-              <w:bottom w:w="50" w:type="dxa"/>
-              <w:left w:w="90" w:type="dxa"/>
-              <w:right w:w="90" w:type="dxa"/>
-            </w:tcMar>
-            <w:vAlign w:val="center"/>
-          </w:tcPr>
-          <w:p>
-            <w:pPr>
-              <w:pStyle w:val="BDOITable"/>
-            </w:pPr>
-            <w:r>
-              <w:rPr>
-                <w:sz w:val="18"/>
-              </w:rPr>
-              <w:t>BDOI</w:t>
-            </w:r>
-          </w:p>
-        </w:tc>
-        <w:tc>
-          <w:tcPr>
-            <w:tcW w:type="dxa" w:w="1813"/>
-            <w:tcMar>
-              <w:top w:w="50" w:type="dxa"/>
-              <w:bottom w:w="50" w:type="dxa"/>
-              <w:left w:w="90" w:type="dxa"/>
-              <w:right w:w="90" w:type="dxa"/>
-            </w:tcMar>
-            <w:vAlign w:val="center"/>
-          </w:tcPr>
-          <w:p>
-            <w:pPr>
-              <w:pStyle w:val="BDOITable"/>
-            </w:pPr>
-          </w:p>
-        </w:tc>
-        <w:tc>
-          <w:tcPr>
-            <w:tcW w:type="dxa" w:w="1133"/>
-            <w:tcMar>
-              <w:top w:w="50" w:type="dxa"/>
-              <w:bottom w:w="50" w:type="dxa"/>
-              <w:left w:w="90" w:type="dxa"/>
-              <w:right w:w="90" w:type="dxa"/>
-            </w:tcMar>
-            <w:vAlign w:val="center"/>
-          </w:tcPr>
-          <w:p>
-            <w:pPr>
-              <w:pStyle w:val="BDOITable"/>
-            </w:pPr>
           </w:p>
         </w:tc>
       </w:tr>

</xml_diff>